<commit_message>
Issue #168: FORM_07 template — keep goods table rows intact across page breaks
Visual acceptance found a genuine pagination defect: a goods data row
could split across a page break ('Kính' at the bottom of p1, 'nổi 5mm'
at the top of p2). Fix: w:cantSplit on the goods table header and loop
rows, applied in the deterministic sanitize script
(scripts/form07_build_sanitized_template.py) so rebuilds stay
byte-identical. Template re-pinned in FORM07.template.json
(sha256 1f49b2e785c50e8ed0f6c99882296a1dd03fc3933bdc1bbe23143b468dddb261,
16962 bytes). tests/test_form07_delivery_receipt.py: 11/11 pass.
</commit_message>
<xml_diff>
--- a/assets/templates/form07/FORM07-bien-ban-giao-nhan-v1.docx
+++ b/assets/templates/form07/FORM07-bien-ban-giao-nhan-v1.docx
@@ -706,6 +706,9 @@
         <w:gridCol w:w="1549"/>
       </w:tblGrid>
       <w:tr>
+        <w:trPr>
+          <w:cantSplit w:val="true"/>
+        </w:trPr>
         <w:tc>
           <w:tcPr>
             <w:tcW w:w="1650" w:type="dxa"/>
@@ -986,6 +989,9 @@
         </w:tc>
       </w:tr>
       <w:tr>
+        <w:trPr>
+          <w:cantSplit w:val="true"/>
+        </w:trPr>
         <w:tc>
           <w:tcPr>
             <w:tcW w:w="1650" w:type="dxa"/>

</xml_diff>